<commit_message>
Polish signed disclosure and show architecture diagram in README
</commit_message>
<xml_diff>
--- a/submission/SRM_Team_Ctrl_Alt_Elite_1_AI_Disclosure.docx
+++ b/submission/SRM_Team_Ctrl_Alt_Elite_1_AI_Disclosure.docx
@@ -5,6 +5,9 @@
     <w:p>
       <w:pPr>
         <w:pStyle w:val="Heading1"/>
+        <w:keepNext w:val="0"/>
+        <w:widowControl/>
+        <w:spacing w:after="120" w:line="252" w:lineRule="auto"/>
         <w:jc w:val="center"/>
       </w:pPr>
       <w:r>
@@ -17,8 +20,19 @@
         <w:t xml:space="preserve"> DISCLOSURE FORM</w:t>
       </w:r>
     </w:p>
-    <w:p/>
     <w:p>
+      <w:pPr>
+        <w:keepNext w:val="0"/>
+        <w:widowControl/>
+        <w:spacing w:after="0" w:line="240" w:lineRule="auto"/>
+      </w:pPr>
+    </w:p>
+    <w:p>
+      <w:pPr>
+        <w:keepNext/>
+        <w:widowControl/>
+        <w:spacing w:after="120" w:line="252" w:lineRule="auto" w:before="200"/>
+      </w:pPr>
       <w:r>
         <w:t xml:space="preserve">1. </w:t>
       </w:r>
@@ -31,6 +45,11 @@
       </w:r>
     </w:p>
     <w:p>
+      <w:pPr>
+        <w:keepNext w:val="0"/>
+        <w:widowControl/>
+        <w:spacing w:after="120" w:line="252" w:lineRule="auto"/>
+      </w:pPr>
       <w:r>
         <w:t>Team Name: SRM_Team Ctrl Alt Elite_1</w:t>
       </w:r>
@@ -39,6 +58,11 @@
       </w:r>
     </w:p>
     <w:p>
+      <w:pPr>
+        <w:keepNext w:val="0"/>
+        <w:widowControl/>
+        <w:spacing w:after="120" w:line="252" w:lineRule="auto"/>
+      </w:pPr>
       <w:r>
         <w:t>Project / Product Name: Agentic Code Intelligence</w:t>
       </w:r>
@@ -47,6 +71,11 @@
       </w:r>
     </w:p>
     <w:p>
+      <w:pPr>
+        <w:keepNext w:val="0"/>
+        <w:widowControl/>
+        <w:spacing w:after="120" w:line="252" w:lineRule="auto"/>
+      </w:pPr>
       <w:r>
         <w:t>Organization / Institution (if any): SRM Institute of Science and Technology</w:t>
       </w:r>
@@ -55,6 +84,11 @@
       </w:r>
     </w:p>
     <w:p>
+      <w:pPr>
+        <w:keepNext w:val="0"/>
+        <w:widowControl/>
+        <w:spacing w:after="120" w:line="252" w:lineRule="auto"/>
+      </w:pPr>
       <w:r>
         <w:t>Submission Date: 30 September 2026</w:t>
       </w:r>
@@ -62,8 +96,19 @@
         <w:t xml:space="preserve"/>
       </w:r>
     </w:p>
-    <w:p/>
     <w:p>
+      <w:pPr>
+        <w:keepNext w:val="0"/>
+        <w:widowControl/>
+        <w:spacing w:after="0" w:line="240" w:lineRule="auto"/>
+      </w:pPr>
+    </w:p>
+    <w:p>
+      <w:pPr>
+        <w:keepNext/>
+        <w:widowControl/>
+        <w:spacing w:after="120" w:line="252" w:lineRule="auto" w:before="200"/>
+      </w:pPr>
       <w:r>
         <w:t xml:space="preserve">2. </w:t>
       </w:r>
@@ -76,6 +121,11 @@
       </w:r>
     </w:p>
     <w:p>
+      <w:pPr>
+        <w:keepNext w:val="0"/>
+        <w:widowControl/>
+        <w:spacing w:after="120" w:line="252" w:lineRule="auto"/>
+      </w:pPr>
       <w:r>
         <w:t>Did your team use</w:t>
       </w:r>
@@ -93,12 +143,28 @@
       </w:r>
     </w:p>
     <w:p>
+      <w:pPr>
+        <w:keepNext w:val="0"/>
+        <w:widowControl/>
+        <w:spacing w:after="120" w:line="252" w:lineRule="auto"/>
+      </w:pPr>
       <w:r>
         <w:t>Yes</w:t>
       </w:r>
     </w:p>
-    <w:p/>
     <w:p>
+      <w:pPr>
+        <w:keepNext w:val="0"/>
+        <w:widowControl/>
+        <w:spacing w:after="0" w:line="240" w:lineRule="auto"/>
+      </w:pPr>
+    </w:p>
+    <w:p>
+      <w:pPr>
+        <w:keepNext/>
+        <w:widowControl/>
+        <w:spacing w:after="120" w:line="252" w:lineRule="auto" w:before="200"/>
+      </w:pPr>
       <w:r>
         <w:t xml:space="preserve">3. </w:t>
       </w:r>
@@ -132,6 +198,11 @@
       </w:r>
     </w:p>
     <w:p>
+      <w:pPr>
+        <w:keepNext w:val="0"/>
+        <w:widowControl/>
+        <w:spacing w:after="120" w:line="252" w:lineRule="auto"/>
+      </w:pPr>
       <w:r>
         <w:t xml:space="preserve">Idea generation / brainstorming: Helped discuss implementation approaches.</w:t>
       </w:r>
@@ -143,34 +214,68 @@
       </w:r>
     </w:p>
     <w:p>
+      <w:pPr>
+        <w:keepNext w:val="0"/>
+        <w:widowControl/>
+        <w:spacing w:after="120" w:line="252" w:lineRule="auto"/>
+      </w:pPr>
       <w:r>
         <w:t xml:space="preserve">UI / UX design: Helped refine the search interface.</w:t>
       </w:r>
     </w:p>
     <w:p>
+      <w:pPr>
+        <w:keepNext w:val="0"/>
+        <w:widowControl/>
+        <w:spacing w:after="120" w:line="252" w:lineRule="auto"/>
+      </w:pPr>
       <w:r>
         <w:t xml:space="preserve">Content creation: Helped revise technical documentation.</w:t>
       </w:r>
     </w:p>
     <w:p>
+      <w:pPr>
+        <w:keepNext w:val="0"/>
+        <w:widowControl/>
+        <w:spacing w:after="120" w:line="252" w:lineRule="auto"/>
+      </w:pPr>
       <w:r>
         <w:t xml:space="preserve">Data analysis: Helped check and present existing evaluation results.</w:t>
       </w:r>
     </w:p>
     <w:p>
+      <w:pPr>
+        <w:keepNext w:val="0"/>
+        <w:widowControl/>
+        <w:spacing w:after="120" w:line="252" w:lineRule="auto"/>
+      </w:pPr>
       <w:r>
         <w:t xml:space="preserve">Testing / debugging: Helped debug and test search routes and runtime behavior.</w:t>
       </w:r>
     </w:p>
     <w:p>
+      <w:pPr>
+        <w:keepNext w:val="0"/>
+        <w:widowControl/>
+        <w:spacing w:after="120" w:line="252" w:lineRule="auto"/>
+      </w:pPr>
       <w:r>
         <w:t xml:space="preserve">Other: The application uses pretrained embedding models for code retrieval.</w:t>
       </w:r>
     </w:p>
-    <w:p/>
+    <w:p>
+      <w:pPr>
+        <w:keepNext w:val="0"/>
+        <w:widowControl/>
+        <w:spacing w:after="0" w:line="240" w:lineRule="auto"/>
+      </w:pPr>
+    </w:p>
     <w:p>
       <w:pPr>
         <w:keepNext/>
+        <w:pageBreakBefore/>
+        <w:widowControl/>
+        <w:spacing w:after="120" w:line="252" w:lineRule="auto" w:before="200"/>
       </w:pPr>
       <w:r>
         <w:t xml:space="preserve">4. </w:t>
@@ -193,6 +298,8 @@
     <w:p>
       <w:pPr>
         <w:keepNext/>
+        <w:widowControl/>
+        <w:spacing w:after="120" w:line="252" w:lineRule="auto"/>
       </w:pPr>
       <w:r>
         <w:t xml:space="preserve">1. Feature Name </w:t>
@@ -210,6 +317,8 @@
     <w:p>
       <w:pPr>
         <w:keepNext/>
+        <w:widowControl/>
+        <w:spacing w:after="120" w:line="252" w:lineRule="auto"/>
       </w:pPr>
       <w:r>
         <w:t xml:space="preserve">2.  Self-Generated/AI-Generated/Both </w:t>
@@ -226,7 +335,10 @@
     </w:p>
     <w:p>
       <w:pPr>
+        <w:keepNext w:val="0"/>
         <w:keepLines/>
+        <w:widowControl/>
+        <w:spacing w:after="120" w:line="252" w:lineRule="auto"/>
       </w:pPr>
       <w:r>
         <w:t xml:space="preserve">3. Description (AI tools/platform used, prompt used, output summary, modification):</w:t>
@@ -280,10 +392,18 @@
         <w:t xml:space="preserve"> We reviewed, adapted and tested the assisted changes before using them.</w:t>
       </w:r>
     </w:p>
-    <w:p/>
+    <w:p>
+      <w:pPr>
+        <w:keepNext w:val="0"/>
+        <w:widowControl/>
+        <w:spacing w:after="0" w:line="240" w:lineRule="auto"/>
+      </w:pPr>
+    </w:p>
     <w:p>
       <w:pPr>
         <w:keepNext/>
+        <w:widowControl/>
+        <w:spacing w:after="120" w:line="252" w:lineRule="auto"/>
       </w:pPr>
       <w:r>
         <w:t xml:space="preserve">1. Feature Name </w:t>
@@ -301,6 +421,8 @@
     <w:p>
       <w:pPr>
         <w:keepNext/>
+        <w:widowControl/>
+        <w:spacing w:after="120" w:line="252" w:lineRule="auto"/>
       </w:pPr>
       <w:r>
         <w:t>2.  Self-Generated/AI-Generated/Both</w:t>
@@ -314,7 +436,10 @@
     </w:p>
     <w:p>
       <w:pPr>
+        <w:keepNext w:val="0"/>
         <w:keepLines/>
+        <w:widowControl/>
+        <w:spacing w:after="120" w:line="252" w:lineRule="auto"/>
       </w:pPr>
       <w:r>
         <w:t xml:space="preserve">3. Description (AI tools/platform used, prompt used, output summary, modification):</w:t>
@@ -368,8 +493,19 @@
         <w:t xml:space="preserve"> We reviewed the interface and refined it based on our requirements.</w:t>
       </w:r>
     </w:p>
-    <w:p/>
     <w:p>
+      <w:pPr>
+        <w:keepNext w:val="0"/>
+        <w:widowControl/>
+        <w:spacing w:after="0" w:line="240" w:lineRule="auto"/>
+      </w:pPr>
+    </w:p>
+    <w:p>
+      <w:pPr>
+        <w:keepNext/>
+        <w:widowControl/>
+        <w:spacing w:after="120" w:line="252" w:lineRule="auto" w:before="200"/>
+      </w:pPr>
       <w:r>
         <w:t>5</w:t>
       </w:r>
@@ -385,6 +521,11 @@
       </w:r>
     </w:p>
     <w:p>
+      <w:pPr>
+        <w:keepNext w:val="0"/>
+        <w:widowControl/>
+        <w:spacing w:after="120" w:line="252" w:lineRule="auto"/>
+      </w:pPr>
       <w:r>
         <w:t>AI usage complies with guidelines and policies.</w:t>
       </w:r>
@@ -400,6 +541,11 @@
       </w:r>
     </w:p>
     <w:p>
+      <w:pPr>
+        <w:keepNext w:val="0"/>
+        <w:widowControl/>
+        <w:spacing w:after="120" w:line="252" w:lineRule="auto"/>
+      </w:pPr>
       <w:r>
         <w:t>No proprietary or copyrighted data misused.</w:t>
       </w:r>
@@ -421,9 +567,17 @@
         <w:t>Agree</w:t>
       </w:r>
     </w:p>
-    <w:p/>
     <w:p>
       <w:pPr>
+        <w:keepNext w:val="0"/>
+        <w:widowControl/>
+        <w:spacing w:after="0" w:line="240" w:lineRule="auto"/>
+      </w:pPr>
+    </w:p>
+    <w:p>
+      <w:pPr>
+        <w:widowControl/>
+        <w:spacing w:after="120" w:line="252" w:lineRule="auto" w:before="200"/>
         <w:rPr>
           <w:b/>
           <w:bCs/>
@@ -447,6 +601,8 @@
     <w:p>
       <w:pPr>
         <w:keepNext/>
+        <w:widowControl/>
+        <w:spacing w:after="120" w:line="252" w:lineRule="auto"/>
       </w:pPr>
       <w:r>
         <w:t>Name of Team Representative: Devansh Singh</w:t>
@@ -455,6 +611,8 @@
     <w:p>
       <w:pPr>
         <w:keepNext/>
+        <w:widowControl/>
+        <w:spacing w:after="120" w:line="252" w:lineRule="auto"/>
       </w:pPr>
       <w:r>
         <w:t>Role: Team Lead</w:t>
@@ -463,6 +621,8 @@
     <w:p>
       <w:pPr>
         <w:keepNext/>
+        <w:widowControl/>
+        <w:spacing w:after="120" w:line="252" w:lineRule="auto"/>
       </w:pPr>
       <w:r>
         <w:t xml:space="preserve">Signature:  </w:t>
@@ -503,6 +663,11 @@
       </w:r>
     </w:p>
     <w:p>
+      <w:pPr>
+        <w:keepNext w:val="0"/>
+        <w:widowControl/>
+        <w:spacing w:after="120" w:line="252" w:lineRule="auto"/>
+      </w:pPr>
       <w:r>
         <w:t>Date: 30 September 2026</w:t>
       </w:r>

</xml_diff>

<commit_message>
Finalize verified full-corpus PRISM submission
</commit_message>
<xml_diff>
--- a/submission/SRM_Team_Ctrl_Alt_Elite_1_AI_Disclosure.docx
+++ b/submission/SRM_Team_Ctrl_Alt_Elite_1_AI_Disclosure.docx
@@ -90,10 +90,7 @@
         <w:spacing w:after="120" w:line="252" w:lineRule="auto"/>
       </w:pPr>
       <w:r>
-        <w:t>Submission Date: 30 September 2026</w:t>
-      </w:r>
-      <w:r>
-        <w:t xml:space="preserve"/>
+        <w:t xml:space="preserve">Submission Date: 4 October 2026</w:t>
       </w:r>
     </w:p>
     <w:p>
@@ -204,13 +201,13 @@
         <w:spacing w:after="120" w:line="252" w:lineRule="auto"/>
       </w:pPr>
       <w:r>
-        <w:t xml:space="preserve">Idea generation / brainstorming: Helped discuss implementation approaches.</w:t>
+        <w:t xml:space="preserve">Idea generation / brainstorming: Helped discuss implementation and evaluation approaches.</w:t>
       </w:r>
       <w:r>
         <w:br/>
       </w:r>
       <w:r>
-        <w:t xml:space="preserve">Code generation or assistance: Assisted with integration, debugging and refinement of existing code.</w:t>
+        <w:t xml:space="preserve">Code generation or assistance: Assisted with targeted implementation, integration and refinement of retrieval and version-history features.</w:t>
       </w:r>
     </w:p>
     <w:p>
@@ -220,7 +217,7 @@
         <w:spacing w:after="120" w:line="252" w:lineRule="auto"/>
       </w:pPr>
       <w:r>
-        <w:t xml:space="preserve">UI / UX design: Helped refine the search interface.</w:t>
+        <w:t xml:space="preserve">UI / UX design: Helped refine search controls, result explanations and error messages.</w:t>
       </w:r>
     </w:p>
     <w:p>
@@ -230,7 +227,7 @@
         <w:spacing w:after="120" w:line="252" w:lineRule="auto"/>
       </w:pPr>
       <w:r>
-        <w:t xml:space="preserve">Content creation: Helped revise technical documentation.</w:t>
+        <w:t xml:space="preserve">Content creation: Assisted with technical documentation and submission materials.</w:t>
       </w:r>
     </w:p>
     <w:p>
@@ -240,7 +237,7 @@
         <w:spacing w:after="120" w:line="252" w:lineRule="auto"/>
       </w:pPr>
       <w:r>
-        <w:t xml:space="preserve">Data analysis: Helped check and present existing evaluation results.</w:t>
+        <w:t xml:space="preserve">Data analysis: Assisted with benchmark verification, numerical consistency checks and interpretation of results.</w:t>
       </w:r>
     </w:p>
     <w:p>
@@ -250,7 +247,7 @@
         <w:spacing w:after="120" w:line="252" w:lineRule="auto"/>
       </w:pPr>
       <w:r>
-        <w:t xml:space="preserve">Testing / debugging: Helped debug and test search routes and runtime behavior.</w:t>
+        <w:t xml:space="preserve">Testing / debugging: Helped develop regression checks, resolve compatibility issues and review cross-platform verification evidence.</w:t>
       </w:r>
     </w:p>
     <w:p>
@@ -273,7 +270,6 @@
     <w:p>
       <w:pPr>
         <w:keepNext/>
-        <w:pageBreakBefore/>
         <w:widowControl/>
         <w:spacing w:after="120" w:line="252" w:lineRule="auto" w:before="200"/>
       </w:pPr>
@@ -302,16 +298,7 @@
         <w:spacing w:after="120" w:line="252" w:lineRule="auto"/>
       </w:pPr>
       <w:r>
-        <w:t xml:space="preserve">1. Feature Name </w:t>
-      </w:r>
-      <w:r>
-        <w:t>:</w:t>
-      </w:r>
-      <w:r>
-        <w:t xml:space="preserve"> </w:t>
-      </w:r>
-      <w:r>
-        <w:t>Code search</w:t>
+        <w:t xml:space="preserve">1. Feature Name : Code search and version history</w:t>
       </w:r>
     </w:p>
     <w:p>
@@ -341,7 +328,13 @@
         <w:spacing w:after="120" w:line="252" w:lineRule="auto"/>
       </w:pPr>
       <w:r>
+        <w:rPr>
+          <w:b/>
+        </w:rPr>
         <w:t xml:space="preserve">3. Description (AI tools/platform used, prompt used, output summary, modification):</w:t>
+      </w:r>
+      <w:r>
+        <w:t xml:space="preserve"/>
       </w:r>
       <w:r>
         <w:br/>
@@ -365,7 +358,7 @@
         <w:t xml:space="preserve">Prompt used (summary):</w:t>
       </w:r>
       <w:r>
-        <w:t xml:space="preserve"> Help integrate the existing code-search backend, improve runtime compatibility and test the search routes.</w:t>
+        <w:t xml:space="preserve"> Help refine retrieval routes, integrate Git-history search, improve CPU compatibility and verify evaluation results.</w:t>
       </w:r>
       <w:r>
         <w:br/>
@@ -377,7 +370,7 @@
         <w:t xml:space="preserve">Output summary:</w:t>
       </w:r>
       <w:r>
-        <w:t xml:space="preserve"> Suggestions and targeted code assistance for integration, compatibility, testing and verification.</w:t>
+        <w:t xml:space="preserve"> Targeted code assistance for retrieval constraints, version filtering, runtime compatibility and benchmark verification.</w:t>
       </w:r>
       <w:r>
         <w:br/>
@@ -389,7 +382,7 @@
         <w:t xml:space="preserve">Modification:</w:t>
       </w:r>
       <w:r>
-        <w:t xml:space="preserve"> We reviewed, adapted and tested the assisted changes before using them.</w:t>
+        <w:t xml:space="preserve"> We reviewed and tested the changes, retained the selected fusion approach and checked results against source evidence.</w:t>
       </w:r>
     </w:p>
     <w:p>
@@ -404,6 +397,7 @@
         <w:keepNext/>
         <w:widowControl/>
         <w:spacing w:after="120" w:line="252" w:lineRule="auto"/>
+        <w:pageBreakBefore/>
       </w:pPr>
       <w:r>
         <w:t xml:space="preserve">1. Feature Name </w:t>
@@ -442,7 +436,13 @@
         <w:spacing w:after="120" w:line="252" w:lineRule="auto"/>
       </w:pPr>
       <w:r>
+        <w:rPr>
+          <w:b/>
+        </w:rPr>
         <w:t xml:space="preserve">3. Description (AI tools/platform used, prompt used, output summary, modification):</w:t>
+      </w:r>
+      <w:r>
+        <w:t xml:space="preserve"/>
       </w:r>
       <w:r>
         <w:br/>
@@ -466,7 +466,7 @@
         <w:t xml:space="preserve">Prompt used (summary):</w:t>
       </w:r>
       <w:r>
-        <w:t xml:space="preserve"> Help implement and refine the search interface, connect it to the API and display retrieved code and results.</w:t>
+        <w:t xml:space="preserve"> Help refine the interface, connect search controls to the backend and clarify results and unsupported requests.</w:t>
       </w:r>
       <w:r>
         <w:br/>
@@ -478,7 +478,7 @@
         <w:t xml:space="preserve">Output summary:</w:t>
       </w:r>
       <w:r>
-        <w:t xml:space="preserve"> Assistance with interface implementation, API integration and UI refinement.</w:t>
+        <w:t xml:space="preserve"> Assistance with interface implementation, version-selection controls, API integration and explanatory messages.</w:t>
       </w:r>
       <w:r>
         <w:br/>
@@ -490,7 +490,105 @@
         <w:t xml:space="preserve">Modification:</w:t>
       </w:r>
       <w:r>
-        <w:t xml:space="preserve"> We reviewed the interface and refined it based on our requirements.</w:t>
+        <w:t xml:space="preserve"> We reviewed and refined the interface and checked its behavior with the backend.</w:t>
+      </w:r>
+    </w:p>
+    <w:p>
+      <w:pPr>
+        <w:keepNext w:val="0"/>
+        <w:widowControl/>
+        <w:spacing w:after="0" w:line="240" w:lineRule="auto"/>
+      </w:pPr>
+    </w:p>
+    <w:p>
+      <w:pPr>
+        <w:keepNext/>
+        <w:widowControl/>
+        <w:spacing w:after="120" w:line="252" w:lineRule="auto"/>
+      </w:pPr>
+      <w:r>
+        <w:t xml:space="preserve">1. Feature Name : Testing and compatibility</w:t>
+      </w:r>
+    </w:p>
+    <w:p>
+      <w:pPr>
+        <w:keepNext/>
+        <w:widowControl/>
+        <w:spacing w:after="120" w:line="252" w:lineRule="auto"/>
+      </w:pPr>
+      <w:r>
+        <w:t>2.  Self-Generated/AI-Generated/Both</w:t>
+      </w:r>
+      <w:r>
+        <w:t xml:space="preserve">: </w:t>
+      </w:r>
+      <w:r>
+        <w:t>Both</w:t>
+      </w:r>
+    </w:p>
+    <w:p>
+      <w:pPr>
+        <w:keepNext w:val="0"/>
+        <w:keepLines/>
+        <w:widowControl/>
+        <w:spacing w:after="120" w:line="252" w:lineRule="auto"/>
+      </w:pPr>
+      <w:r>
+        <w:rPr>
+          <w:b/>
+        </w:rPr>
+        <w:t xml:space="preserve">3. Description (AI tools/platform used, prompt used, output summary, modification):</w:t>
+      </w:r>
+      <w:r>
+        <w:t xml:space="preserve"/>
+      </w:r>
+      <w:r>
+        <w:br/>
+      </w:r>
+      <w:r>
+        <w:rPr>
+          <w:b/>
+        </w:rPr>
+        <w:t xml:space="preserve">AI tool:</w:t>
+      </w:r>
+      <w:r>
+        <w:t xml:space="preserve"> OpenAI Codex.</w:t>
+      </w:r>
+      <w:r>
+        <w:br/>
+      </w:r>
+      <w:r>
+        <w:rPr>
+          <w:b/>
+        </w:rPr>
+        <w:t xml:space="preserve">Prompt used (summary):</w:t>
+      </w:r>
+      <w:r>
+        <w:t xml:space="preserve"> Help test retrieval behavior and investigate cross-platform compatibility issues.</w:t>
+      </w:r>
+      <w:r>
+        <w:br/>
+      </w:r>
+      <w:r>
+        <w:rPr>
+          <w:b/>
+        </w:rPr>
+        <w:t xml:space="preserve">Output summary:</w:t>
+      </w:r>
+      <w:r>
+        <w:t xml:space="preserve"> Assistance with regression testing, debugging and Windows compatibility fixes.</w:t>
+      </w:r>
+      <w:r>
+        <w:br/>
+      </w:r>
+      <w:r>
+        <w:rPr>
+          <w:b/>
+        </w:rPr>
+        <w:t xml:space="preserve">Modification:</w:t>
+      </w:r>
+      <w:r>
+        <w:t xml:space="preserve"> Team members ran the checks, reviewed the results and confirmed the corrected candidate on Windows.</w:t>
       </w:r>
     </w:p>
     <w:p>
@@ -669,7 +767,7 @@
         <w:spacing w:after="120" w:line="252" w:lineRule="auto"/>
       </w:pPr>
       <w:r>
-        <w:t>Date: 30 September 2026</w:t>
+        <w:t xml:space="preserve">Date: 4 October 2026</w:t>
       </w:r>
     </w:p>
     <w:sectPr>

</xml_diff>